<commit_message>
Update controlled ES.SOP.089.F01.V01 Word template: fire N/A and layout
</commit_message>
<xml_diff>
--- a/templates/ES.SOP.089.F01.V01 - COSHH Assessment.docx
+++ b/templates/ES.SOP.089.F01.V01 - COSHH Assessment.docx
@@ -400,14 +400,14 @@
               <w:rPr>
                 <w:b/>
               </w:rPr>
-              <w:t>Material code</w:t>
+              <w:t>Process / intended use</w:t>
             </w:r>
           </w:p>
         </w:tc>
         <w:tc>
           <w:tcPr>
-            <w:tcW w:w="3312" w:type="dxa"/>
-            <w:gridSpan w:val="3"/>
+            <w:tcW w:w="8688" w:type="dxa"/>
+            <w:gridSpan w:val="8"/>
             <w:tcMar>
               <w:top w:w="40" w:type="dxa"/>
               <w:left w:w="80" w:type="dxa"/>
@@ -420,54 +420,7 @@
             <w:pPr>
               <w:spacing w:after="0" w:line="240" w:lineRule="auto"/>
             </w:pPr>
-            <w:sdt>
-              <w:sdtPr>
-                <w:alias w:val="USR_MATERIAL_CODE"/>
-                <w:tag w:val="USR_MATERIAL_CODE"/>
-                <w:id w:val="1983581331"/>
-                <w:text/>
-              </w:sdtPr>
-              <w:sdtContent/>
-            </w:sdt>
           </w:p>
-        </w:tc>
-        <w:tc>
-          <w:tcPr>
-            <w:tcW w:w="1944" w:type="dxa"/>
-            <w:gridSpan w:val="2"/>
-            <w:shd w:val="clear" w:color="auto" w:fill="E8F0F6"/>
-            <w:tcMar>
-              <w:top w:w="40" w:type="dxa"/>
-              <w:left w:w="80" w:type="dxa"/>
-              <w:bottom w:w="40" w:type="dxa"/>
-              <w:right w:w="80" w:type="dxa"/>
-            </w:tcMar>
-            <w:vAlign w:val="center"/>
-          </w:tcPr>
-          <w:p>
-            <w:pPr>
-              <w:spacing w:after="0" w:line="240" w:lineRule="auto"/>
-            </w:pPr>
-            <w:r>
-              <w:rPr>
-                <w:b/>
-              </w:rPr>
-              <w:t>Process / intended use</w:t>
-            </w:r>
-          </w:p>
-        </w:tc>
-        <w:tc>
-          <w:tcPr>
-            <w:tcW w:w="3432" w:type="dxa"/>
-            <w:gridSpan w:val="3"/>
-            <w:tcMar>
-              <w:top w:w="40" w:type="dxa"/>
-              <w:left w:w="80" w:type="dxa"/>
-              <w:bottom w:w="40" w:type="dxa"/>
-              <w:right w:w="80" w:type="dxa"/>
-            </w:tcMar>
-            <w:vAlign w:val="center"/>
-          </w:tcPr>
           <w:p>
             <w:pPr>
               <w:spacing w:after="0" w:line="240" w:lineRule="auto"/>
@@ -477,9 +430,14 @@
                 <w:alias w:val="USR_PROCESS_INTENDED_USE"/>
                 <w:tag w:val="USR_PROCESS_INTENDED_USE"/>
                 <w:id w:val="-1388562472"/>
+                <w:showingPlcHdr/>
                 <w:text/>
               </w:sdtPr>
-              <w:sdtContent/>
+              <w:sdtContent>
+                <w:r>
+                  <w:t xml:space="preserve">     </w:t>
+                </w:r>
+              </w:sdtContent>
             </w:sdt>
           </w:p>
         </w:tc>
@@ -3505,7 +3463,7 @@
     </w:p>
     <w:tbl>
       <w:tblPr>
-        <w:tblW w:w="0" w:type="auto"/>
+        <w:tblW w:w="10584" w:type="dxa"/>
         <w:tblInd w:w="80" w:type="dxa"/>
         <w:tblBorders>
           <w:top w:val="single" w:sz="4" w:space="0" w:color="auto"/>
@@ -3520,8 +3478,9 @@
       </w:tblPr>
       <w:tblGrid>
         <w:gridCol w:w="2592"/>
-        <w:gridCol w:w="3996"/>
-        <w:gridCol w:w="3996"/>
+        <w:gridCol w:w="2710"/>
+        <w:gridCol w:w="2835"/>
+        <w:gridCol w:w="2447"/>
       </w:tblGrid>
       <w:tr>
         <w:trPr>
@@ -3555,7 +3514,7 @@
         <w:tc>
           <w:tcPr>
             <w:tcW w:w="7992" w:type="dxa"/>
-            <w:gridSpan w:val="2"/>
+            <w:gridSpan w:val="3"/>
             <w:tcMar>
               <w:top w:w="40" w:type="dxa"/>
               <w:left w:w="80" w:type="dxa"/>
@@ -3612,7 +3571,7 @@
         <w:tc>
           <w:tcPr>
             <w:tcW w:w="7992" w:type="dxa"/>
-            <w:gridSpan w:val="2"/>
+            <w:gridSpan w:val="3"/>
             <w:tcMar>
               <w:top w:w="40" w:type="dxa"/>
               <w:left w:w="80" w:type="dxa"/>
@@ -3669,7 +3628,7 @@
         <w:tc>
           <w:tcPr>
             <w:tcW w:w="7992" w:type="dxa"/>
-            <w:gridSpan w:val="2"/>
+            <w:gridSpan w:val="3"/>
             <w:tcMar>
               <w:top w:w="40" w:type="dxa"/>
               <w:left w:w="80" w:type="dxa"/>
@@ -3726,7 +3685,7 @@
         <w:tc>
           <w:tcPr>
             <w:tcW w:w="7992" w:type="dxa"/>
-            <w:gridSpan w:val="2"/>
+            <w:gridSpan w:val="3"/>
             <w:tcMar>
               <w:top w:w="40" w:type="dxa"/>
               <w:left w:w="80" w:type="dxa"/>
@@ -3770,7 +3729,6 @@
           </w:tcPr>
           <w:p>
             <w:pPr>
-              <w:pageBreakBefore/>
               <w:spacing w:after="0" w:line="240" w:lineRule="auto"/>
             </w:pPr>
             <w:r>
@@ -3785,7 +3743,7 @@
         <w:tc>
           <w:tcPr>
             <w:tcW w:w="7992" w:type="dxa"/>
-            <w:gridSpan w:val="2"/>
+            <w:gridSpan w:val="3"/>
             <w:tcMar>
               <w:top w:w="40" w:type="dxa"/>
               <w:left w:w="80" w:type="dxa"/>
@@ -3796,6 +3754,7 @@
           </w:tcPr>
           <w:p>
             <w:pPr>
+              <w:keepNext/>
               <w:spacing w:after="0" w:line="240" w:lineRule="auto"/>
             </w:pPr>
             <w:sdt>
@@ -3845,7 +3804,7 @@
         <w:tc>
           <w:tcPr>
             <w:tcW w:w="7992" w:type="dxa"/>
-            <w:gridSpan w:val="2"/>
+            <w:gridSpan w:val="3"/>
             <w:tcMar>
               <w:top w:w="40" w:type="dxa"/>
               <w:left w:w="80" w:type="dxa"/>
@@ -3856,6 +3815,7 @@
           </w:tcPr>
           <w:p>
             <w:pPr>
+              <w:keepNext/>
               <w:spacing w:after="0" w:line="240" w:lineRule="auto"/>
             </w:pPr>
             <w:sdt>
@@ -3907,8 +3867,8 @@
         </w:tc>
         <w:tc>
           <w:tcPr>
-            <w:tcW w:w="3996" w:type="dxa"/>
-            <w:shd w:val="clear" w:color="auto" w:fill="000000" w:themeFill="text1"/>
+            <w:tcW w:w="2710" w:type="dxa"/>
+            <w:shd w:val="clear" w:color="auto" w:fill="D9D9D9" w:themeFill="background1" w:themeFillShade="D9"/>
             <w:tcMar>
               <w:top w:w="40" w:type="dxa"/>
               <w:left w:w="80" w:type="dxa"/>
@@ -3930,22 +3890,15 @@
               </w:rPr>
             </w:pPr>
             <w:r>
-              <w:rPr>
-                <w:color w:val="FFFFFF" w:themeColor="background1"/>
-              </w:rPr>
               <w:t>Carbon Dioxide (CO</w:t>
             </w:r>
             <w:r>
               <w:rPr>
-                <w:color w:val="FFFFFF" w:themeColor="background1"/>
                 <w:vertAlign w:val="subscript"/>
               </w:rPr>
               <w:t>2</w:t>
             </w:r>
             <w:r>
-              <w:rPr>
-                <w:color w:val="FFFFFF" w:themeColor="background1"/>
-              </w:rPr>
               <w:t xml:space="preserve">)  </w:t>
             </w:r>
             <w:sdt>
@@ -3953,7 +3906,6 @@
                 <w:rPr>
                   <w:rFonts w:cs="Arial"/>
                   <w:noProof/>
-                  <w:color w:val="FFFFFF" w:themeColor="background1"/>
                   <w:sz w:val="20"/>
                   <w:szCs w:val="20"/>
                 </w:rPr>
@@ -3971,7 +3923,6 @@
                   <w:rPr>
                     <w:rFonts w:ascii="MS Gothic" w:eastAsia="MS Gothic" w:hAnsi="MS Gothic" w:cs="Arial" w:hint="eastAsia"/>
                     <w:noProof/>
-                    <w:color w:val="FFFFFF" w:themeColor="background1"/>
                     <w:sz w:val="20"/>
                     <w:szCs w:val="20"/>
                   </w:rPr>
@@ -3983,7 +3934,7 @@
         </w:tc>
         <w:tc>
           <w:tcPr>
-            <w:tcW w:w="3996" w:type="dxa"/>
+            <w:tcW w:w="2835" w:type="dxa"/>
             <w:shd w:val="clear" w:color="auto" w:fill="FFFFCC"/>
             <w:vAlign w:val="center"/>
           </w:tcPr>
@@ -4028,6 +3979,63 @@
                 <w:alias w:val="DER_FIRE_FOAM"/>
                 <w:tag w:val="DER_FIRE_FOAM"/>
                 <w:id w:val="-448391438"/>
+                <w14:checkbox>
+                  <w14:checked w14:val="0"/>
+                  <w14:checkedState w14:val="2612" w14:font="MS Gothic"/>
+                  <w14:uncheckedState w14:val="2610" w14:font="MS Gothic"/>
+                </w14:checkbox>
+              </w:sdtPr>
+              <w:sdtContent>
+                <w:r>
+                  <w:rPr>
+                    <w:rFonts w:ascii="MS Gothic" w:eastAsia="MS Gothic" w:hAnsi="MS Gothic" w:cs="Arial" w:hint="eastAsia"/>
+                    <w:noProof/>
+                    <w:sz w:val="20"/>
+                    <w:szCs w:val="20"/>
+                  </w:rPr>
+                  <w:t>☐</w:t>
+                </w:r>
+              </w:sdtContent>
+            </w:sdt>
+          </w:p>
+        </w:tc>
+        <w:tc>
+          <w:tcPr>
+            <w:tcW w:w="2447" w:type="dxa"/>
+            <w:vAlign w:val="center"/>
+          </w:tcPr>
+          <w:p>
+            <w:pPr>
+              <w:spacing w:before="60"/>
+              <w:jc w:val="center"/>
+              <w:rPr>
+                <w:rFonts w:cs="Arial"/>
+                <w:noProof/>
+                <w:color w:val="002060"/>
+                <w:sz w:val="20"/>
+                <w:szCs w:val="20"/>
+              </w:rPr>
+            </w:pPr>
+            <w:r>
+              <w:rPr>
+                <w:rFonts w:cs="Arial"/>
+                <w:noProof/>
+                <w:sz w:val="20"/>
+                <w:szCs w:val="20"/>
+              </w:rPr>
+              <w:t xml:space="preserve">N/A </w:t>
+            </w:r>
+            <w:sdt>
+              <w:sdtPr>
+                <w:rPr>
+                  <w:rFonts w:cs="Arial"/>
+                  <w:noProof/>
+                  <w:sz w:val="20"/>
+                  <w:szCs w:val="20"/>
+                </w:rPr>
+                <w:alias w:val="DER_FIRE_NA"/>
+                <w:tag w:val="DER_FIRE_NA"/>
+                <w:id w:val="-1805461082"/>
                 <w14:checkbox>
                   <w14:checked w14:val="0"/>
                   <w14:checkedState w14:val="2612" w14:font="MS Gothic"/>

</xml_diff>

<commit_message>
Correct COSHH Section 9 pagination and Responsible Person default
</commit_message>
<xml_diff>
--- a/templates/ES.SOP.089.F01.V01 - COSHH Assessment.docx
+++ b/templates/ES.SOP.089.F01.V01 - COSHH Assessment.docx
@@ -8361,7 +8361,11 @@
                 <w:id w:val="-1955859936"/>
                 <w:text/>
               </w:sdtPr>
-              <w:sdtContent/>
+              <w:sdtContent>
+                <w:r>
+                  <w:t>Imran Patel</w:t>
+                </w:r>
+              </w:sdtContent>
             </w:sdt>
           </w:p>
         </w:tc>
@@ -8541,7 +8545,6 @@
     <w:p>
       <w:pPr>
         <w:pStyle w:val="Heading1"/>
-        <w:pageBreakBefore/>
         <w:numPr>
           <w:ilvl w:val="0"/>
           <w:numId w:val="10"/>

</xml_diff>

<commit_message>
Update COSHH Section 5 to half-face respirator and retag controls
</commit_message>
<xml_diff>
--- a/templates/ES.SOP.089.F01.V01 - COSHH Assessment.docx
+++ b/templates/ES.SOP.089.F01.V01 - COSHH Assessment.docx
@@ -4932,7 +4932,7 @@
                 <w:bCs/>
                 <w:szCs w:val="18"/>
               </w:rPr>
-              <w:t>Full-face</w:t>
+              <w:t>Half-face</w:t>
             </w:r>
             <w:r>
               <w:rPr>
@@ -5466,8 +5466,8 @@
                   <w:sz w:val="40"/>
                   <w:szCs w:val="40"/>
                 </w:rPr>
-                <w:alias w:val="DER_PPE_PRODUCTION_FULL_FACE_RESPIRATOR"/>
-                <w:tag w:val="DER_PPE_PRODUCTION_FULL_FACE_RESPIRATOR"/>
+                <w:alias w:val="DER_PPE_PRODUCTION_HALF_FACE_RESPIRATOR"/>
+                <w:tag w:val="DER_PPE_PRODUCTION_HALF_FACE_RESPIRATOR"/>
                 <w:id w:val="2120565583"/>
                 <w14:checkbox>
                   <w14:checked w14:val="0"/>
@@ -5929,8 +5929,8 @@
                   <w:sz w:val="40"/>
                   <w:szCs w:val="40"/>
                 </w:rPr>
-                <w:alias w:val="DER_PPE_RND_FULL_FACE_RESPIRATOR"/>
-                <w:tag w:val="DER_PPE_RND_FULL_FACE_RESPIRATOR"/>
+                <w:alias w:val="DER_PPE_RND_HALF_FACE_RESPIRATOR"/>
+                <w:tag w:val="DER_PPE_RND_HALF_FACE_RESPIRATOR"/>
                 <w:id w:val="-540821700"/>
                 <w14:checkbox>
                   <w14:checked w14:val="0"/>
@@ -6392,8 +6392,8 @@
                   <w:sz w:val="40"/>
                   <w:szCs w:val="40"/>
                 </w:rPr>
-                <w:alias w:val="DER_PPE_QC_FULL_FACE_RESPIRATOR"/>
-                <w:tag w:val="DER_PPE_QC_FULL_FACE_RESPIRATOR"/>
+                <w:alias w:val="DER_PPE_QC_HALF_FACE_RESPIRATOR"/>
+                <w:tag w:val="DER_PPE_QC_HALF_FACE_RESPIRATOR"/>
                 <w:id w:val="-689146550"/>
                 <w14:checkbox>
                   <w14:checked w14:val="0"/>
@@ -6855,8 +6855,8 @@
                   <w:sz w:val="40"/>
                   <w:szCs w:val="40"/>
                 </w:rPr>
-                <w:alias w:val="DER_PPE_OFFICE_WAREHOUSE_FULL_FACE_RESPIRATOR"/>
-                <w:tag w:val="DER_PPE_OFFICE_WAREHOUSE_FULL_FACE_RESPIRATOR"/>
+                <w:alias w:val="DER_PPE_OFFICE_WAREHOUSE_HALF_FACE_RESPIRATOR"/>
+                <w:tag w:val="DER_PPE_OFFICE_WAREHOUSE_HALF_FACE_RESPIRATOR"/>
                 <w:id w:val="-1004357656"/>
                 <w14:checkbox>
                   <w14:checked w14:val="0"/>
@@ -7318,8 +7318,8 @@
                   <w:sz w:val="40"/>
                   <w:szCs w:val="40"/>
                 </w:rPr>
-                <w:alias w:val="DER_PPE_SPILLAGE_FULL_FACE_RESPIRATOR"/>
-                <w:tag w:val="DER_PPE_SPILLAGE_FULL_FACE_RESPIRATOR"/>
+                <w:alias w:val="DER_PPE_SPILLAGE_HALF_FACE_RESPIRATOR"/>
+                <w:tag w:val="DER_PPE_SPILLAGE_HALF_FACE_RESPIRATOR"/>
                 <w:id w:val="484592906"/>
                 <w14:checkbox>
                   <w14:checked w14:val="0"/>

</xml_diff>